<commit_message>
Tarea 1.7: rewrite prose in a more personal student voice
</commit_message>
<xml_diff>
--- a/3er-semestre/visualizacion-grandes-bases-datos/tareas/Tarea1_7/Tarea1_7_VisualizacionGBD_CarlosPulidoRosas.docx
+++ b/3er-semestre/visualizacion-grandes-bases-datos/tareas/Tarea1_7/Tarea1_7_VisualizacionGBD_CarlosPulidoRosas.docx
@@ -559,7 +559,7 @@
           <w:i w:val="0"/>
           <w:sz w:val="20"/>
         </w:rPr>
-        <w:t>En la Tarea 1.6 completé la serie de NO₂ de la estación Centro con el CO y ajusté modelos de regresión múltiple del NO₂ con el PM10 y el PM2.5. Ahora toca refinar ese modelo: forzar el plano de regresión a pasar por el origen, NO₂ = b₁·PM10 + b₂·PM2.5, y quitar los valores atípicos de las tres variables. Después lo comparo contra los modelos de la 1.6 para responder cuatro preguntas: si mejoró la correlación, si mejoraron el R² y los residuales, cómo se relacionan las partículas entre sí y qué nos dice el modelo.</w:t>
+        <w:t>En la tarea anterior completé el NO₂ de la estación Centro con el CO y armé modelos de regresión múltiple con el PM10 y el PM2.5. En esta tarea refino ese modelo. Le quité el intercepto para que el plano pase por el origen, NO₂ = b₁·PM10 + b₂·PM2.5, quité los atípicos de las tres variables y comparé el resultado contra los modelos de la 1.6.</w:t>
       </w:r>
     </w:p>
     <w:p>
@@ -575,7 +575,7 @@
           <w:i w:val="0"/>
           <w:sz w:val="20"/>
         </w:rPr>
-        <w:t>Uso las mismas dos series de la tarea anterior: la serie completada, que incluye el NO₂ imputado (6,752 horas con las tres variables), y la serie observada, solo con NO₂ medido (2,611 horas). La segunda sirve como control, porque no depende de la imputación.</w:t>
+        <w:t>Trabajé con las mismas dos series de la 1.6. La completada tiene el NO₂ imputado y suma 6,752 horas con las tres variables. La observada solo tiene NO₂ medido (2,611 horas) y la uso para comprobar que lo que veo no sea efecto de la imputación.</w:t>
       </w:r>
     </w:p>
     <w:p>
@@ -625,7 +625,7 @@
           <w:i w:val="0"/>
           <w:sz w:val="20"/>
         </w:rPr>
-        <w:t>Como en las tareas 1.5 y 1.6, usé el criterio de Tukey: una hora es atípica si el NO₂, el PM10 o el PM2.5 queda fuera de [Q1 − 1.5·RIC, Q3 + 1.5·RIC]. Si una hora es atípica en cualquiera de las tres, la quito completa. Así quedan 6,260 horas en la serie completada y 2,395 en la observada. Para ver el efecto de este paso, también calculé todo con los datos sin depurar.</w:t>
+        <w:t>Seguí el mismo criterio de Tukey de las tareas pasadas. Si en una hora el NO₂, el PM10 o el PM2.5 quedan fuera de [Q1 − 1.5·RIC, Q3 + 1.5·RIC], quito esa hora completa. Me quedaron 6,260 horas en la serie completada y 2,395 en la observada. También calculé las correlaciones con los datos sin depurar para ver qué cambiaba.</w:t>
       </w:r>
     </w:p>
     <w:p>
@@ -658,7 +658,7 @@
           <w:i w:val="0"/>
           <w:sz w:val="20"/>
         </w:rPr>
-        <w:t>El modelo de la 1.6 tenía intercepto, NO₂ = b₀ + b₁·PM10 + b₂·PM2.5. El refinado lo quita, así que cuando las dos partículas valen cero el NO₂ estimado también es cero. Para comparar los dos modelos de forma justa no basta con el R² que reporta cada uno, porque en un modelo sin intercepto el R² se calcula contra cero y no contra el promedio, y por eso sale mucho más alto aunque el ajuste sea peor (lo mismo que vimos en la Tarea 1.5). Por eso comparo también el R² calculado contra el promedio en los dos modelos, el error cuadrático medio (RMSE) y el promedio de los residuales, que en un modelo sin sesgo debe ser cero.</w:t>
+        <w:t>El modelo de la 1.6 era NO₂ = b₀ + b₁·PM10 + b₂·PM2.5. Al quitarle b₀, el modelo supone que si no hay partículas tampoco hay NO₂. Para compararlos no me quise quedar solo con el R² que da cada modelo. Como vimos en la Tarea 1.5, cuando no hay intercepto el R² se mide contra cero y no contra el promedio, y sale alto aunque el modelo ajuste mal. Así que además calculé el R² contra el promedio en los dos casos, el RMSE y el promedio de los residuales.</w:t>
       </w:r>
     </w:p>
     <w:p>
@@ -691,7 +691,7 @@
           <w:i w:val="0"/>
           <w:sz w:val="20"/>
         </w:rPr>
-        <w:t>Para la relación entre el PM10 y el PM2.5 uso su correlación, una recta por el origen PM2.5 = b·PM10 y, siguiendo la sesión 9, el algoritmo de K-medias. K-medias agrupa las horas en k grupos minimizando J = Σ Σ ‖xᵢ − cⱼ‖², la suma de las distancias euclidianas al cuadrado de cada punto a su centroide. Antes de agrupar estandaricé las dos variables para que pesaran igual, y elegí k con el criterio del codo.</w:t>
+        <w:t>Para ver cómo se relacionan el PM10 y el PM2.5 usé su correlación y una recta por el origen PM2.5 = b·PM10. También probé K-medias, que vimos en la sesión 9. El algoritmo junta las horas en k grupos buscando que la suma J = Σ Σ ‖xᵢ − cⱼ‖² de las distancias al centroide sea la menor posible. Estandaricé las dos variables antes de agrupar para que ninguna pesara más y escogí k con la gráfica del codo.</w:t>
       </w:r>
     </w:p>
     <w:p>
@@ -741,7 +741,7 @@
           <w:i w:val="0"/>
           <w:sz w:val="20"/>
         </w:rPr>
-        <w:t>La Tabla 1 compara las correlaciones antes y después de quitar los atípicos.</w:t>
+        <w:t>En la Tabla 1 están las correlaciones antes y después de quitar los atípicos.</w:t>
       </w:r>
     </w:p>
     <w:tbl>
@@ -1222,7 +1222,7 @@
           <w:i w:val="0"/>
           <w:sz w:val="20"/>
         </w:rPr>
-        <w:t>No, la correlación no mejoró, bajó. En la serie observada la del NO₂ con el PM10 pasa de 0.694 a 0.604, y con el PM2.5 de 0.570 a 0.541. Es lo mismo que pasó con las partículas en la Tarea 1.5: los atípicos son horas de contaminación muy alta en las que suben todos los contaminantes al mismo tiempo, y esos pocos puntos lejanos inflaban la correlación. Sin ellos la relación se ve más débil, pero es más representativa de lo que pasa en un día normal. Forzar el modelo por el origen no cambia esto, porque la correlación de Pearson no depende del modelo que se ajuste.</w:t>
+        <w:t>La correlación no mejoró. Bajó en todos los pares. Con los datos observados, la del NO₂ con el PM10 pasó de 0.694 a 0.604. Ya me había pasado algo parecido con las partículas en la Tarea 1.5. Las horas atípicas son episodios de mucha contaminación donde todo sube al mismo tiempo, y como quedan muy lejos del resto, jalan la correlación hacia arriba. Sin ellas la relación es más débil, pero se parece más a lo que pasa normalmente. El origen aquí no influye, porque la correlación no depende del modelo.</w:t>
       </w:r>
     </w:p>
     <w:p>
@@ -1255,7 +1255,7 @@
           <w:i w:val="0"/>
           <w:sz w:val="20"/>
         </w:rPr>
-        <w:t>La Tabla 2 compara el modelo de la Tarea 1.6 con el refinado en las dos series.</w:t>
+        <w:t>La Tabla 2 pone lado a lado el modelo de la 1.6 y el refinado.</w:t>
       </w:r>
     </w:p>
     <w:tbl>
@@ -2164,7 +2164,7 @@
           <w:i w:val="0"/>
           <w:sz w:val="20"/>
         </w:rPr>
-        <w:t>A primera vista el modelo refinado mejora muchísimo: el R² pasa de 0.317 a 0.796 en la serie completada y de 0.365 a 0.788 en la observada. Pero esa mejora no es real. Ese R² está calculado contra cero, y como el NO₂ casi nunca está cerca de cero, casi cualquier plano que pase cerca de los puntos da un valor alto. Cuando calculo el R² contra el promedio en los dos modelos, el refinado baja a 0.133 en la serie completada y a 0.301 en la observada, es decir, explica menos que el de la 1.6. El RMSE también sube, de 10.90 a 12.29 ppb en la serie completada y de 9.63 a 10.11 ppb en la observada.</w:t>
+        <w:t>Cuando vi el R² del modelo refinado pensé que había mejorado mucho, porque en la serie completada subió de 0.317 a 0.796. Luego recordé lo de la Tarea 1.5. Ese R² se mide contra cero, y como el NO₂ casi nunca vale cero, cualquier plano más o menos cercano a los puntos da un número alto. Con el R² medido contra el promedio, que es el que sí se puede comparar, el refinado cae a 0.133 en la serie completada y a 0.301 en la observada. Los dos quedan por debajo de los de la 1.6. El RMSE también empeora, de 10.9 a 12.3 ppb en la serie completada.</w:t>
       </w:r>
     </w:p>
     <w:p>
@@ -2180,7 +2180,7 @@
           <w:i w:val="0"/>
           <w:sz w:val="20"/>
         </w:rPr>
-        <w:t>Con los residuales pasa lo mismo. El modelo de la 1.6 tiene residual medio cero, como debe ser en una regresión con intercepto. El refinado tiene un residual medio de +2.86 ppb en la serie completada: en promedio se queda corto y subestima el NO₂. La Figura 1 lo muestra comparando lo real con lo estimado, y la Figura 2 con los residuales.</w:t>
+        <w:t>Los residuales tampoco mejoraron. En la 1.6 su promedio es cero, que es lo normal cuando el modelo tiene intercepto. En el refinado el promedio es de +2.9 ppb, o sea que en general el modelo se queda corto. Las Figuras 1 y 2 lo muestran.</w:t>
       </w:r>
     </w:p>
     <w:p>
@@ -2310,7 +2310,23 @@
           <w:i w:val="0"/>
           <w:sz w:val="20"/>
         </w:rPr>
-        <w:t>En la parte de arriba de la Figura 2 se ve el problema. En el modelo de la 1.6 el promedio móvil de los residuales queda pegado al cero en casi todo el rango. En el refinado tiene una pendiente clara: queda por encima de cero cuando el NO₂ estimado es bajo y por debajo cuando es alto. O sea, en las horas con pocas partículas el modelo predice casi nada de NO₂ cuando en realidad sí hay, y en las horas con muchas partículas se pasa. Un residual con tendencia así indica que al modelo le falta algo, en este caso la constante. (La línea recta de puntos que se ve arriba en las dos gráficas son las horas imputadas que quedaron fijas en el valor límite de 0.059 ppm en la Tarea 1.6.) En el histograma de abajo la distribución de los residuales del modelo refinado está corrida a la derecha del cero. Lo que no cambia casi nada es la correlación entre el NO₂ real y el estimado (0.563 contra 0.562), así que los dos modelos ordenan igual las horas de más a menos contaminadas; lo que el refinado pierde es el nivel.</w:t>
+        <w:t>Lo más claro está en la parte de arriba de la Figura 2. En la 1.6 la línea roja, que es el promedio móvil de los residuales, se mantiene casi pegada al cero. En el refinado va bajando. Cuando el modelo estima poco NO₂ los residuales son positivos, y cuando estima mucho son negativos. Eso quiere decir que en horas con pocas partículas el modelo predice muy poco NO₂ cuando sí lo hay, y en horas con muchas partículas se pasa. Si los residuales tienen una tendencia así, al modelo le falta algo, y aquí lo que le falta es la constante. En el histograma de abajo también se nota, porque los residuales del refinado están corridos a la derecha del cero.</w:t>
+      </w:r>
+    </w:p>
+    <w:p>
+      <w:pPr>
+        <w:keepNext w:val="0"/>
+        <w:spacing w:before="0" w:after="100"/>
+        <w:jc w:val="both"/>
+      </w:pPr>
+      <w:r>
+        <w:rPr>
+          <w:rFonts w:ascii="Calibri" w:hAnsi="Calibri"/>
+          <w:b w:val="0"/>
+          <w:i w:val="0"/>
+          <w:sz w:val="20"/>
+        </w:rPr>
+        <w:t>Hay dos detalles más en la figura. La línea recta de puntos que se ve en la parte de arriba son horas imputadas que en la 1.6 quedaron fijas en el valor límite de 0.059 ppm. Y la correlación entre el NO₂ real y el estimado casi no cambia (0.563 y 0.562). Los dos modelos ordenan las horas casi igual de más a menos contaminadas; el refinado lo que pierde es el nivel.</w:t>
       </w:r>
     </w:p>
     <w:p>
@@ -2343,7 +2359,7 @@
           <w:i w:val="0"/>
           <w:sz w:val="20"/>
         </w:rPr>
-        <w:t>El PM10 y el PM2.5 son, por mucho, el par más correlacionado de todo el análisis (r = 0.876 con datos observados y 0.815 en la serie completada, ya sin atípicos). Tiene sentido, porque el PM10 incluye al PM2.5. Una recta por el origen lo resume bien: PM2.5 ≈ 0.39·PM10 (R²₀ = 0.930), o sea que alrededor del 39 % de la masa de PM10 son partículas finas. El VIF de 4.31 en los datos observados confirma que hay colinealidad moderada entre las dos.</w:t>
+        <w:t>El PM10 y el PM2.5 son el par con la correlación más alta de todo el análisis, 0.876 con los datos observados y 0.815 en la serie completada. Era de esperarse, porque el PM2.5 forma parte del PM10. Con una recta por el origen me salió PM2.5 ≈ 0.39·PM10 (R²₀ = 0.930), es decir, cerca del 39 % del PM10 son partículas finas. El VIF de 4.31 indica colinealidad moderada entre las dos.</w:t>
       </w:r>
     </w:p>
     <w:p>
@@ -2359,7 +2375,7 @@
           <w:i w:val="0"/>
           <w:sz w:val="20"/>
         </w:rPr>
-        <w:t>Para ver si había distintos tipos de horas según sus partículas, apliqué K-medias a las horas observadas. La curva del codo (Figura 3, derecha) baja rápido hasta k = 3 y luego se aplana, así que usé tres grupos. Sus promedios están en la Tabla 3.</w:t>
+        <w:t>Con K-medias quería ver si había distintos tipos de horas según sus partículas. En la gráfica del codo (Figura 3, derecha) la J baja mucho hasta k = 3 y después casi no cambia, así que me quedé con tres grupos. Sus promedios están en la Tabla 3.</w:t>
       </w:r>
     </w:p>
     <w:p>
@@ -2983,7 +2999,23 @@
           <w:i w:val="0"/>
           <w:sz w:val="20"/>
         </w:rPr>
-        <w:t>Los grupos no separan tipos de partículas sino niveles de contaminación: bajo, medio y alto. Los tres caen sobre la misma diagonal, y la proporción de finas cambia poco, de 0.36 en el grupo bajo a 0.41 en el alto. Esto refuerza la idea de que el PM10 y el PM2.5 se mueven casi como una sola variable. Lo interesante es que el NO₂ también sube de grupo en grupo, de 13.2 a 32.8 ppb, aunque el NO₂ no se usó para formar los grupos. Pero incluso en el grupo bajo el NO₂ promedio es de 13.2 ppb, lejos de cero, y eso explica por qué forzar el modelo por el origen no funciona aquí.</w:t>
+        <w:t>No salieron tipos de partículas distintos. Los tres grupos están sobre la misma diagonal y lo que los separa es qué tanta contaminación hay, poca, media o mucha. La proporción de finas cambia poco, de 0.36 en el grupo bajo a 0.41 en el alto. Esto me confirma que el PM10 y el PM2.5 se mueven casi como si fueran una sola variable.</w:t>
+      </w:r>
+    </w:p>
+    <w:p>
+      <w:pPr>
+        <w:keepNext w:val="0"/>
+        <w:spacing w:before="0" w:after="100"/>
+        <w:jc w:val="both"/>
+      </w:pPr>
+      <w:r>
+        <w:rPr>
+          <w:rFonts w:ascii="Calibri" w:hAnsi="Calibri"/>
+          <w:b w:val="0"/>
+          <w:i w:val="0"/>
+          <w:sz w:val="20"/>
+        </w:rPr>
+        <w:t>Lo que sí me llamó la atención es el NO₂. No lo usé para formar los grupos y aun así sube de uno a otro, de 13.2 a 32.8 ppb. Además, en el grupo con menos partículas el NO₂ sigue en 13.2 ppb, que está lejos de cero. Ahí se ve por qué el modelo por el origen no funciona con estos datos.</w:t>
       </w:r>
     </w:p>
     <w:p>
@@ -3016,7 +3048,7 @@
           <w:i w:val="0"/>
           <w:sz w:val="20"/>
         </w:rPr>
-        <w:t>En el modelo refinado de la serie completada, cada µg/m³ de PM10 se asocia con 0.39 ppb de NO₂ y cada µg/m³ de PM2.5 con 0.52 ppb. Los dos coeficientes salieron más grandes que en la 1.6 (0.20 y 0.40). No es que las partículas ahora pesen más, sino que, al quitarle el intercepto, las pendientes tienen que absorber el NO₂ que antes explicaba la constante, que era de 11.2 ppb en la serie completada y de 6.0 ppb en la observada, y que era claramente distinta de cero.</w:t>
+        <w:t>En el modelo refinado de la serie completada, cada µg/m³ de PM10 va con 0.39 ppb de NO₂ y cada µg/m³ de PM2.5 con 0.52 ppb. En la 1.6 eran 0.20 y 0.40. Las pendientes crecieron porque, al quitar la constante, tienen que cargar con el NO₂ que antes explicaba ella. Esa constante valía 11.2 ppb en la serie completada y 6.0 ppb en la observada, y en los dos casos era significativa.</w:t>
       </w:r>
     </w:p>
     <w:p>
@@ -3032,7 +3064,7 @@
           <w:i w:val="0"/>
           <w:sz w:val="20"/>
         </w:rPr>
-        <w:t>Esa constante tiene una lectura física. Con el CO forzar el origen funcionaba, porque los dos salen del mismo escape de los coches. Con las partículas no pasa lo mismo: hay horas con poco polvo y poco PM2.5 que siguen teniendo NO₂ por el tráfico, y horas con muchas partículas por polvo o construcción que no tienen tanto NO₂. Las partículas tienen fuentes que el NO₂ no comparte, así que no hay razón para que el NO₂ valga cero cuando las partículas valen cero. El modelo refinado lo deja ver: al quitar la constante, el ajuste empeora y los residuales quedan sesgados.</w:t>
+        <w:t>Creo que la razón es física. Con el CO funcionó forzar el origen porque el CO y el NO₂ salen del mismo escape. Las partículas, en cambio, también vienen del polvo, de la construcción y de otras cosas que no producen NO₂. Hay horas con pocas partículas en las que sigue habiendo NO₂ por el tráfico, y horas con mucho polvo y no tanto NO₂. Por eso no tiene sentido que el NO₂ sea cero cuando las partículas son cero, y el modelo refinado lo confirma, porque al quitar la constante ajusta peor y los residuales quedan sesgados.</w:t>
       </w:r>
     </w:p>
     <w:p>
@@ -3065,7 +3097,7 @@
           <w:i w:val="0"/>
           <w:sz w:val="20"/>
         </w:rPr>
-        <w:t>Quitar los atípicos de NO₂, PM10 y PM2.5 bajó la correlación, porque esas horas extremas, en las que todo sube al mismo tiempo, la estaban inflando. El resultado depurado es más débil, pero más honesto. Forzar el plano por el origen subió el R² del modelo de 0.317 a 0.796, pero es un efecto de cómo se calcula ese R² sin intercepto. Medido contra el promedio bajó a 0.133, el RMSE subió y los residuales quedaron con un sesgo positivo, así que el modelo refinado es peor que el de la 1.6.</w:t>
+        <w:t>Al quitar los atípicos la correlación bajó, porque esas horas extremas la estaban inflando. Forzar el plano por el origen hizo que el R² del modelo subiera de 0.317 a 0.796, pero eso es por la forma en que se calcula sin intercepto. Comparado de forma justa bajó a 0.133, el RMSE subió y los residuales quedaron sesgados. En resumen, el modelo refinado es peor que el de la 1.6.</w:t>
       </w:r>
     </w:p>
     <w:p>
@@ -3081,7 +3113,7 @@
           <w:i w:val="0"/>
           <w:sz w:val="20"/>
         </w:rPr>
-        <w:t>El PM10 y el PM2.5 están muy relacionados (r ≈ 0.88) y el PM2.5 es cerca del 39 % del PM10. K-medias no encontró grupos de distinto tipo, solo niveles de contaminación sobre la misma diagonal, y el NO₂ sube junto con esos niveles. Para describir el NO₂ con partículas me quedaría con el modelo con intercepto de la Tarea 1.6, o con la separación en fracción fina y gruesa, y dejaría la recta por el origen para pares como el NO₂ y el CO, que sí comparten fuente.</w:t>
+        <w:t>El PM10 y el PM2.5 están muy relacionados y el PM2.5 es más o menos el 39 % del PM10. K-medias no encontró tipos de horas distintos, solo niveles de contaminación, y el NO₂ sube junto con ellos. Si tuviera que describir el NO₂ con partículas usaría el modelo con intercepto de la 1.6 o el de fracción fina y gruesa. La recta por el origen la dejaría para casos como el NO₂ con el CO, que sí vienen de la misma fuente.</w:t>
       </w:r>
     </w:p>
     <w:p>

</xml_diff>